<commit_message>
fix(equations): drop a line break's spacing option, keep [-led lines, real tracked test
- gatheredLines skips a break's own `*` and `[4pt]` option (reusing
  findMatchingBracket) instead of writing it into the next line as text.
- The reader prefixes `{}` to a line that opens with `[` or `*`, so
  read -> edit doesn't take it for the break's option.
- The tracked-edit test checks the markers: <w:del> holds both old lines,
  <w:ins> both new ones (read --accepted/--baseline don't filter tracked
  equations yet, so the old toContain checks passed either way).
- equations.docx gains a "Multi-line block (display)" entry so the
  multi-<m:oMath> shape round-trips through LibreOffice.

Follows the triage review on #30.
</commit_message>
<xml_diff>
--- a/tests/fixtures/equations.docx
+++ b/tests/fixtures/equations.docx
@@ -5999,6 +5999,72 @@
               <m:sty m:val="p"/>
             </m:rPr>
             <m:t>(1)</m:t>
+          </m:r>
+        </m:oMath>
+      </m:oMathPara>
+    </w:p>
+    <w:p>
+      <w:r>
+        <w:br w:type="column"/>
+      </w:r>
+    </w:p>
+    <w:p>
+      <w:r>
+        <w:t xml:space="preserve">Multi-line block (display)</w:t>
+      </w:r>
+    </w:p>
+    <w:p>
+      <m:oMathPara>
+        <m:oMath>
+          <m:r>
+            <m:t>a</m:t>
+          </m:r>
+          <m:r>
+            <m:rPr>
+              <m:sty m:val="p"/>
+            </m:rPr>
+            <m:t>+</m:t>
+          </m:r>
+          <m:r>
+            <m:t>b</m:t>
+          </m:r>
+          <m:r>
+            <m:rPr>
+              <m:sty m:val="p"/>
+            </m:rPr>
+            <m:t>=</m:t>
+          </m:r>
+          <m:r>
+            <m:t>c</m:t>
+          </m:r>
+        </m:oMath>
+        <m:oMath>
+          <m:sSup>
+            <m:e>
+              <m:r>
+                <m:t>x</m:t>
+              </m:r>
+            </m:e>
+            <m:sup>
+              <m:r>
+                <m:rPr>
+                  <m:sty m:val="p"/>
+                </m:rPr>
+                <m:t>2</m:t>
+              </m:r>
+            </m:sup>
+          </m:sSup>
+          <m:r>
+            <m:rPr>
+              <m:sty m:val="p"/>
+            </m:rPr>
+            <m:t>=</m:t>
+          </m:r>
+          <m:r>
+            <m:rPr>
+              <m:sty m:val="p"/>
+            </m:rPr>
+            <m:t>4</m:t>
           </m:r>
         </m:oMath>
       </m:oMathPara>

</xml_diff>